<commit_message>
Table 5 notes moved into Results text; upload set rebuilt
Co-Authored-By: Claude Opus 5.5 <noreply@anthropic.com>
Claude-Session: https://claude.ai/code/session_01GmqQpV3GfnfDawN9ZdytqY
</commit_message>
<xml_diff>
--- a/paper/submission/em_upload/tables_editable.docx
+++ b/paper/submission/em_upload/tables_editable.docx
@@ -2396,13 +2396,6 @@
               </w:rPr>
               <w:t>Matched</w:t>
             </w:r>
-            <w:r>
-              <w:rPr>
-                <w:b/>
-                <w:vertAlign w:val="superscript"/>
-              </w:rPr>
-              <w:t>b</w:t>
-            </w:r>
           </w:p>
         </w:tc>
         <w:tc>
@@ -2816,13 +2809,6 @@
               </w:rPr>
               <w:t>Weight noise</w:t>
             </w:r>
-            <w:r>
-              <w:rPr>
-                <w:b w:val="0"/>
-                <w:vertAlign w:val="superscript"/>
-              </w:rPr>
-              <w:t>a</w:t>
-            </w:r>
           </w:p>
         </w:tc>
         <w:tc>
@@ -2916,13 +2902,6 @@
               </w:rPr>
               <w:t>Diverged</w:t>
             </w:r>
-            <w:r>
-              <w:rPr>
-                <w:b w:val="0"/>
-                <w:vertAlign w:val="superscript"/>
-              </w:rPr>
-              <w:t>c</w:t>
-            </w:r>
           </w:p>
         </w:tc>
         <w:tc>
@@ -3005,60 +2984,6 @@
         </w:tc>
       </w:tr>
     </w:tbl>
-    <w:p>
-      <w:r>
-        <w:rPr>
-          <w:b w:val="0"/>
-          <w:sz w:val="18"/>
-        </w:rPr>
-        <w:t xml:space="preserve">TPR columns give the TPR at 1% or 0.1% FPR. </w:t>
-      </w:r>
-      <w:r>
-        <w:rPr>
-          <w:b w:val="0"/>
-          <w:sz w:val="18"/>
-          <w:vertAlign w:val="superscript"/>
-        </w:rPr>
-        <w:t>a</w:t>
-      </w:r>
-      <w:r>
-        <w:rPr>
-          <w:b w:val="0"/>
-          <w:sz w:val="18"/>
-        </w:rPr>
-        <w:t xml:space="preserve">Unclipped Gaussian noise with s=0.003 on client weights, no formal guarantee. </w:t>
-      </w:r>
-      <w:r>
-        <w:rPr>
-          <w:b w:val="0"/>
-          <w:sz w:val="18"/>
-          <w:vertAlign w:val="superscript"/>
-        </w:rPr>
-        <w:t>b</w:t>
-      </w:r>
-      <w:r>
-        <w:rPr>
-          <w:b w:val="0"/>
-          <w:sz w:val="18"/>
-        </w:rPr>
-        <w:t xml:space="preserve">TPR at 1% FPR with non-members reweighted to the members' source and class mix. </w:t>
-      </w:r>
-      <w:r>
-        <w:rPr>
-          <w:b w:val="0"/>
-          <w:sz w:val="18"/>
-          <w:vertAlign w:val="superscript"/>
-        </w:rPr>
-        <w:t>c</w:t>
-      </w:r>
-      <w:r>
-        <w:rPr>
-          <w:b w:val="0"/>
-          <w:sz w:val="18"/>
-        </w:rPr>
-        <w:t>Weight noise s=0.5, training diverged. Bal. acc., clean balanced accuracy.</w:t>
-      </w:r>
-    </w:p>
     <w:p/>
     <w:sectPr>
       <w:pgSz w:w="12240" w:h="15840"/>

</xml_diff>